<commit_message>
feat: comprehensive platform improvements - extraction methods, benchmarks, and UI
</commit_message>
<xml_diff>
--- a/backend/tests/fixtures/sample.docx
+++ b/backend/tests/fixtures/sample.docx
@@ -7,17 +7,12 @@
         <w:pStyle w:val="Heading1"/>
       </w:pPr>
       <w:r>
-        <w:t>Test Document</w:t>
+        <w:t>Quarterly Report Q3 2024</w:t>
       </w:r>
     </w:p>
     <w:p>
       <w:r>
-        <w:t>This is a test paragraph for DOCX parsing.</w:t>
-      </w:r>
-    </w:p>
-    <w:p>
-      <w:r>
-        <w:t>Another paragraph with some content.</w:t>
+        <w:t>This report summarizes Q3 2024 performance for Acme Corporation.</w:t>
       </w:r>
     </w:p>
     <w:p>
@@ -25,12 +20,22 @@
         <w:pStyle w:val="Heading2"/>
       </w:pPr>
       <w:r>
-        <w:t>Section 1</w:t>
+        <w:t>Financial Summary</w:t>
       </w:r>
     </w:p>
     <w:p>
       <w:r>
-        <w:t>Content for section 1 with some details.</w:t>
+        <w:t>Total Revenue: $1,250,000</w:t>
+      </w:r>
+    </w:p>
+    <w:p>
+      <w:r>
+        <w:t>Operating Expenses: $875,000</w:t>
+      </w:r>
+    </w:p>
+    <w:p>
+      <w:r>
+        <w:t>Net Profit: $375,000</w:t>
       </w:r>
     </w:p>
     <w:p>
@@ -38,12 +43,45 @@
         <w:pStyle w:val="Heading2"/>
       </w:pPr>
       <w:r>
-        <w:t>Section 2</w:t>
+        <w:t>Key Metrics</w:t>
       </w:r>
     </w:p>
     <w:p>
       <w:r>
-        <w:t>Content for section 2 with more information.</w:t>
+        <w:t>Customer Acquisition: 1,200 new customers</w:t>
+      </w:r>
+    </w:p>
+    <w:p>
+      <w:r>
+        <w:t>Churn Rate: 2.3%</w:t>
+      </w:r>
+    </w:p>
+    <w:p>
+      <w:r>
+        <w:t>Average Revenue Per User: $104.17</w:t>
+      </w:r>
+    </w:p>
+    <w:p>
+      <w:pPr>
+        <w:pStyle w:val="Heading2"/>
+      </w:pPr>
+      <w:r>
+        <w:t>Regional Breakdown</w:t>
+      </w:r>
+    </w:p>
+    <w:p>
+      <w:r>
+        <w:t>North America: $625,000 (50%)</w:t>
+      </w:r>
+    </w:p>
+    <w:p>
+      <w:r>
+        <w:t>Europe: $375,000 (30%)</w:t>
+      </w:r>
+    </w:p>
+    <w:p>
+      <w:r>
+        <w:t>Asia Pacific: $250,000 (20%)</w:t>
       </w:r>
     </w:p>
     <w:sectPr>

</xml_diff>